<commit_message>
Add calculation history saved across rotation
History of successful calculations is shown above the expression in
portrait and in a History dialog (toolbar button) in both orientations.
It is saved in the Bundle as ArrayList<String>; state is now restored
in onCreate behind a null check, and an open history dialog is reopened
after rotation. Adds a guide on saving state, null checks and layout
types, and updates the full study guide.

Co-Authored-By: Claude Opus 5.5 <noreply@anthropic.com>
Claude-Session: https://claude.ai/code/session_0178i139i7VGbi3H4suwX75x
</commit_message>
<xml_diff>
--- a/docs/lab2-polnyi-razbor.docx
+++ b/docs/lab2-polnyi-razbor.docx
@@ -594,108 +594,173 @@
     </w:p>
     <w:p>
       <w:pPr>
-        <w:pStyle w:val="Heading1"/>
-      </w:pPr>
-      <w:r>
-        <w:t xml:space="preserve">Часть 3. Где лежит код</w:t>
-      </w:r>
-    </w:p>
-    <w:p>
-      <w:pPr>
-        <w:pStyle w:val="Code"/>
-        <w:spacing w:after="0" w:before="80"/>
-      </w:pPr>
-      <w:r>
-        <w:t xml:space="preserve">app/src/main/</w:t>
-      </w:r>
-    </w:p>
-    <w:p>
-      <w:pPr>
-        <w:pStyle w:val="Code"/>
-        <w:spacing w:after="0" w:before="0"/>
-      </w:pPr>
-      <w:r>
-        <w:t xml:space="preserve">├── AndroidManifest.xml              ← «паспорт» приложения</w:t>
-      </w:r>
-    </w:p>
-    <w:p>
-      <w:pPr>
-        <w:pStyle w:val="Code"/>
-        <w:spacing w:after="0" w:before="0"/>
-      </w:pPr>
-      <w:r>
-        <w:t xml:space="preserve">├── java/com/example/calculator/</w:t>
-      </w:r>
-    </w:p>
-    <w:p>
-      <w:pPr>
-        <w:pStyle w:val="Code"/>
-        <w:spacing w:after="0" w:before="0"/>
-      </w:pPr>
-      <w:r>
-        <w:t xml:space="preserve">│   ├── MainActivity.java            ← экран (кнопки, ввод, поворот)</w:t>
-      </w:r>
-    </w:p>
-    <w:p>
-      <w:pPr>
-        <w:pStyle w:val="Code"/>
-        <w:spacing w:after="0" w:before="0"/>
-      </w:pPr>
-      <w:r>
-        <w:t xml:space="preserve">│   ├── ExpressionEvaluator.java     ← вычисление выражения</w:t>
-      </w:r>
-    </w:p>
-    <w:p>
-      <w:pPr>
-        <w:pStyle w:val="Code"/>
-        <w:spacing w:after="0" w:before="0"/>
-      </w:pPr>
-      <w:r>
-        <w:t xml:space="preserve">│   └── CalculationException.java    ← класс ошибки</w:t>
-      </w:r>
-    </w:p>
-    <w:p>
-      <w:pPr>
-        <w:pStyle w:val="Code"/>
-        <w:spacing w:after="0" w:before="0"/>
-      </w:pPr>
-      <w:r>
-        <w:t xml:space="preserve">└── res/</w:t>
-      </w:r>
-    </w:p>
-    <w:p>
-      <w:pPr>
-        <w:pStyle w:val="Code"/>
-        <w:spacing w:after="0" w:before="0"/>
-      </w:pPr>
-      <w:r>
-        <w:t xml:space="preserve">    ├── layout/activity_main.xml       ← разметка (портрет)</w:t>
-      </w:r>
-    </w:p>
-    <w:p>
-      <w:pPr>
-        <w:pStyle w:val="Code"/>
-        <w:spacing w:after="0" w:before="0"/>
-      </w:pPr>
-      <w:r>
-        <w:t xml:space="preserve">    ├── layout-land/activity_main.xml  ← разметка (альбом)</w:t>
-      </w:r>
-    </w:p>
-    <w:p>
-      <w:pPr>
-        <w:pStyle w:val="Code"/>
-        <w:spacing w:after="120" w:before="0"/>
-      </w:pPr>
-      <w:r>
-        <w:t xml:space="preserve">    └── values/                        ← строки, цвета, стили</w:t>
-      </w:r>
-    </w:p>
-    <w:p>
+        <w:pStyle w:val="ListParagraph"/>
+        <w:numPr>
+          <w:ilvl w:val="0"/>
+          <w:numId w:val="4"/>
+        </w:numPr>
+        <w:spacing w:after="60"/>
+      </w:pPr>
       <w:r>
         <w:rPr>
           <w:b/>
           <w:bCs/>
         </w:rPr>
+        <w:t xml:space="preserve">Добавили историю вычислений:</w:t>
+      </w:r>
+      <w:r>
+        <w:t xml:space="preserve"> она видна в портретной ориентации над выражением и в окне «История» (кнопка на верхней панели), сохраняется при повороте в Bundle как </w:t>
+      </w:r>
+      <w:r>
+        <w:rPr>
+          <w:rFonts w:ascii="Consolas" w:cs="Consolas" w:eastAsia="Consolas" w:hAnsi="Consolas"/>
+          <w:color w:val="4A2A6A"/>
+          <w:sz w:val="21"/>
+          <w:szCs w:val="21"/>
+        </w:rPr>
+        <w:t xml:space="preserve">ArrayList&lt;String&gt;</w:t>
+      </w:r>
+      <w:r>
+        <w:t xml:space="preserve">. Восстановление идёт в </w:t>
+      </w:r>
+      <w:r>
+        <w:rPr>
+          <w:rFonts w:ascii="Consolas" w:cs="Consolas" w:eastAsia="Consolas" w:hAnsi="Consolas"/>
+          <w:color w:val="4A2A6A"/>
+          <w:sz w:val="21"/>
+          <w:szCs w:val="21"/>
+        </w:rPr>
+        <w:t xml:space="preserve">onCreate</w:t>
+      </w:r>
+      <w:r>
+        <w:t xml:space="preserve"> с проверкой </w:t>
+      </w:r>
+      <w:r>
+        <w:rPr>
+          <w:rFonts w:ascii="Consolas" w:cs="Consolas" w:eastAsia="Consolas" w:hAnsi="Consolas"/>
+          <w:color w:val="4A2A6A"/>
+          <w:sz w:val="21"/>
+          <w:szCs w:val="21"/>
+        </w:rPr>
+        <w:t xml:space="preserve">savedInstanceState != null</w:t>
+      </w:r>
+      <w:r>
+        <w:t xml:space="preserve">.</w:t>
+      </w:r>
+    </w:p>
+    <w:p>
+      <w:pPr>
+        <w:pStyle w:val="Heading1"/>
+      </w:pPr>
+      <w:r>
+        <w:t xml:space="preserve">Часть 3. Где лежит код</w:t>
+      </w:r>
+    </w:p>
+    <w:p>
+      <w:pPr>
+        <w:pStyle w:val="Code"/>
+        <w:spacing w:after="0" w:before="80"/>
+      </w:pPr>
+      <w:r>
+        <w:t xml:space="preserve">app/src/main/</w:t>
+      </w:r>
+    </w:p>
+    <w:p>
+      <w:pPr>
+        <w:pStyle w:val="Code"/>
+        <w:spacing w:after="0" w:before="0"/>
+      </w:pPr>
+      <w:r>
+        <w:t xml:space="preserve">├── AndroidManifest.xml              ← «паспорт» приложения</w:t>
+      </w:r>
+    </w:p>
+    <w:p>
+      <w:pPr>
+        <w:pStyle w:val="Code"/>
+        <w:spacing w:after="0" w:before="0"/>
+      </w:pPr>
+      <w:r>
+        <w:t xml:space="preserve">├── java/com/example/calculator/</w:t>
+      </w:r>
+    </w:p>
+    <w:p>
+      <w:pPr>
+        <w:pStyle w:val="Code"/>
+        <w:spacing w:after="0" w:before="0"/>
+      </w:pPr>
+      <w:r>
+        <w:t xml:space="preserve">│   ├── MainActivity.java            ← экран (кнопки, ввод, поворот)</w:t>
+      </w:r>
+    </w:p>
+    <w:p>
+      <w:pPr>
+        <w:pStyle w:val="Code"/>
+        <w:spacing w:after="0" w:before="0"/>
+      </w:pPr>
+      <w:r>
+        <w:t xml:space="preserve">│   ├── ExpressionEvaluator.java     ← вычисление выражения</w:t>
+      </w:r>
+    </w:p>
+    <w:p>
+      <w:pPr>
+        <w:pStyle w:val="Code"/>
+        <w:spacing w:after="0" w:before="0"/>
+      </w:pPr>
+      <w:r>
+        <w:t xml:space="preserve">│   └── CalculationException.java    ← класс ошибки</w:t>
+      </w:r>
+    </w:p>
+    <w:p>
+      <w:pPr>
+        <w:pStyle w:val="Code"/>
+        <w:spacing w:after="0" w:before="0"/>
+      </w:pPr>
+      <w:r>
+        <w:t xml:space="preserve">└── res/</w:t>
+      </w:r>
+    </w:p>
+    <w:p>
+      <w:pPr>
+        <w:pStyle w:val="Code"/>
+        <w:spacing w:after="0" w:before="0"/>
+      </w:pPr>
+      <w:r>
+        <w:t xml:space="preserve">    ├── layout/activity_main.xml       ← разметка (портрет)</w:t>
+      </w:r>
+    </w:p>
+    <w:p>
+      <w:pPr>
+        <w:pStyle w:val="Code"/>
+        <w:spacing w:after="0" w:before="0"/>
+      </w:pPr>
+      <w:r>
+        <w:t xml:space="preserve">    ├── layout-land/activity_main.xml  ← разметка (альбом)</w:t>
+      </w:r>
+    </w:p>
+    <w:p>
+      <w:pPr>
+        <w:pStyle w:val="Code"/>
+        <w:spacing w:after="0" w:before="0"/>
+      </w:pPr>
+      <w:r>
+        <w:t xml:space="preserve">    ├── menu/main_menu.xml             ← кнопка «История» на верхней панели</w:t>
+      </w:r>
+    </w:p>
+    <w:p>
+      <w:pPr>
+        <w:pStyle w:val="Code"/>
+        <w:spacing w:after="120" w:before="0"/>
+      </w:pPr>
+      <w:r>
+        <w:t xml:space="preserve">    └── values/                        ← строки, цвета, стили</w:t>
+      </w:r>
+    </w:p>
+    <w:p>
+      <w:r>
+        <w:rPr>
+          <w:b/>
+          <w:bCs/>
+        </w:rPr>
         <w:t xml:space="preserve">Как всё связано:</w:t>
       </w:r>
     </w:p>
@@ -794,6 +859,15 @@
         <w:spacing w:after="0" w:before="0"/>
       </w:pPr>
       <w:r>
+        <w:t xml:space="preserve">import android.text.TextUtils;       // TextUtils.join — склеить список строк (для истории)</w:t>
+      </w:r>
+    </w:p>
+    <w:p>
+      <w:pPr>
+        <w:pStyle w:val="Code"/>
+        <w:spacing w:after="0" w:before="0"/>
+      </w:pPr>
+      <w:r>
         <w:t xml:space="preserve">import android.util.Log;             // запись сообщений в Logcat (журнал)</w:t>
       </w:r>
     </w:p>
@@ -803,6 +877,24 @@
         <w:spacing w:after="0" w:before="0"/>
       </w:pPr>
       <w:r>
+        <w:t xml:space="preserve">import android.view.Menu;            // меню верхней панели</w:t>
+      </w:r>
+    </w:p>
+    <w:p>
+      <w:pPr>
+        <w:pStyle w:val="Code"/>
+        <w:spacing w:after="0" w:before="0"/>
+      </w:pPr>
+      <w:r>
+        <w:t xml:space="preserve">import android.view.MenuItem;        // пункт меню («История»)</w:t>
+      </w:r>
+    </w:p>
+    <w:p>
+      <w:pPr>
+        <w:pStyle w:val="Code"/>
+        <w:spacing w:after="0" w:before="0"/>
+      </w:pPr>
+      <w:r>
         <w:t xml:space="preserve">import android.view.View;            // View — базовый класс любого элемента экрана</w:t>
       </w:r>
     </w:p>
@@ -830,6 +922,15 @@
         <w:spacing w:after="0" w:before="0"/>
       </w:pPr>
       <w:r>
+        <w:t xml:space="preserve">import android.widget.ScrollView;    // прокручиваемый контейнер (для истории)</w:t>
+      </w:r>
+    </w:p>
+    <w:p>
+      <w:pPr>
+        <w:pStyle w:val="Code"/>
+        <w:spacing w:after="0" w:before="0"/>
+      </w:pPr>
+      <w:r>
         <w:t xml:space="preserve">import android.widget.TextView;      // текстовое поле</w:t>
       </w:r>
     </w:p>
@@ -884,6 +985,15 @@
         <w:spacing w:after="0" w:before="0"/>
       </w:pPr>
       <w:r>
+        <w:t xml:space="preserve">import androidx.appcompat.app.AlertDialog;       // всплывающее окно (окно истории)</w:t>
+      </w:r>
+    </w:p>
+    <w:p>
+      <w:pPr>
+        <w:pStyle w:val="Code"/>
+        <w:spacing w:after="0" w:before="0"/>
+      </w:pPr>
+      <w:r>
         <w:t xml:space="preserve">import androidx.appcompat.app.AppCompatActivity; // базовый класс экрана</w:t>
       </w:r>
     </w:p>
@@ -935,10 +1045,37 @@
     <w:p>
       <w:pPr>
         <w:pStyle w:val="Code"/>
+        <w:spacing w:after="0" w:before="0"/>
+      </w:pPr>
+      <w:r>
+        <w:t xml:space="preserve">import com.google.android.material.appbar.MaterialToolbar;               // верхняя панель</w:t>
+      </w:r>
+    </w:p>
+    <w:p>
+      <w:pPr>
+        <w:pStyle w:val="Code"/>
+        <w:spacing w:after="0" w:before="0"/>
+      </w:pPr>
+      <w:r>
+        <w:t xml:space="preserve">import com.google.android.material.dialog.MaterialAlertDialogBuilder;    // построитель окна</w:t>
+      </w:r>
+    </w:p>
+    <w:p>
+      <w:pPr>
+        <w:pStyle w:val="Code"/>
+        <w:spacing w:after="0" w:before="0"/>
+      </w:pPr>
+      <w:r>
+        <w:t xml:space="preserve"> </w:t>
+      </w:r>
+    </w:p>
+    <w:p>
+      <w:pPr>
+        <w:pStyle w:val="Code"/>
         <w:spacing w:after="120" w:before="0"/>
       </w:pPr>
       <w:r>
-        <w:t xml:space="preserve">import com.google.android.material.appbar.MaterialToolbar; // верхняя панель с заголовком</w:t>
+        <w:t xml:space="preserve">import java.util.ArrayList;          // список (для истории)</w:t>
       </w:r>
     </w:p>
     <w:p>
@@ -1101,6 +1238,24 @@
         <w:spacing w:after="0" w:before="0"/>
       </w:pPr>
       <w:r>
+        <w:t xml:space="preserve">private static final String KEY_HISTORY = "history";                         // история</w:t>
+      </w:r>
+    </w:p>
+    <w:p>
+      <w:pPr>
+        <w:pStyle w:val="Code"/>
+        <w:spacing w:after="0" w:before="0"/>
+      </w:pPr>
+      <w:r>
+        <w:t xml:space="preserve">private static final String KEY_HISTORY_DIALOG_OPEN = "history_dialog_open"; // открыто ли окно истории</w:t>
+      </w:r>
+    </w:p>
+    <w:p>
+      <w:pPr>
+        <w:pStyle w:val="Code"/>
+        <w:spacing w:after="0" w:before="0"/>
+      </w:pPr>
+      <w:r>
         <w:t xml:space="preserve"> </w:t>
       </w:r>
     </w:p>
@@ -1116,10 +1271,28 @@
     <w:p>
       <w:pPr>
         <w:pStyle w:val="Code"/>
+        <w:spacing w:after="0" w:before="0"/>
+      </w:pPr>
+      <w:r>
+        <w:t xml:space="preserve">private static final int MAX_HISTORY = 50;   // максимум записей в истории (Bundle — для небольших данных)</w:t>
+      </w:r>
+    </w:p>
+    <w:p>
+      <w:pPr>
+        <w:pStyle w:val="Code"/>
+        <w:spacing w:after="0" w:before="0"/>
+      </w:pPr>
+      <w:r>
+        <w:t xml:space="preserve">private static final String MINUS = "−";     // минус с кнопки (это не дефис "-")</w:t>
+      </w:r>
+    </w:p>
+    <w:p>
+      <w:pPr>
+        <w:pStyle w:val="Code"/>
         <w:spacing w:after="120" w:before="0"/>
       </w:pPr>
       <w:r>
-        <w:t xml:space="preserve">private static final String MINUS = "−";     // минус с кнопки (это не дефис "-")</w:t>
+        <w:t xml:space="preserve">private static final String HISTORY_SEPARATOR = " = ";  // разделитель в записи "2+3 = 5"</w:t>
       </w:r>
     </w:p>
     <w:p>
@@ -1201,6 +1374,33 @@
         <w:spacing w:after="0" w:before="0"/>
       </w:pPr>
       <w:r>
+        <w:t xml:space="preserve">private ScrollView historyScroll;  // прокрутка истории — есть только в портретной разметке</w:t>
+      </w:r>
+    </w:p>
+    <w:p>
+      <w:pPr>
+        <w:pStyle w:val="Code"/>
+        <w:spacing w:after="0" w:before="0"/>
+      </w:pPr>
+      <w:r>
+        <w:t xml:space="preserve">private TextView historyView;      // текст истории — в альбомной разметке его нет (будет null)</w:t>
+      </w:r>
+    </w:p>
+    <w:p>
+      <w:pPr>
+        <w:pStyle w:val="Code"/>
+        <w:spacing w:after="0" w:before="0"/>
+      </w:pPr>
+      <w:r>
+        <w:t xml:space="preserve">private AlertDialog historyDialog; // окно истории (null, пока его не открывали)</w:t>
+      </w:r>
+    </w:p>
+    <w:p>
+      <w:pPr>
+        <w:pStyle w:val="Code"/>
+        <w:spacing w:after="0" w:before="0"/>
+      </w:pPr>
+      <w:r>
         <w:t xml:space="preserve"> </w:t>
       </w:r>
     </w:p>
@@ -1243,10 +1443,28 @@
     <w:p>
       <w:pPr>
         <w:pStyle w:val="Code"/>
+        <w:spacing w:after="0" w:before="0"/>
+      </w:pPr>
+      <w:r>
+        <w:t xml:space="preserve">private boolean degreeMode = false;      // false = радианы, true = градусы</w:t>
+      </w:r>
+    </w:p>
+    <w:p>
+      <w:pPr>
+        <w:pStyle w:val="Code"/>
+        <w:spacing w:after="0" w:before="0"/>
+      </w:pPr>
+      <w:r>
+        <w:t xml:space="preserve">private ArrayList&lt;String&gt; history = new ArrayList&lt;&gt;(); // история: "2+3 = 5", старые в начале</w:t>
+      </w:r>
+    </w:p>
+    <w:p>
+      <w:pPr>
+        <w:pStyle w:val="Code"/>
         <w:spacing w:after="120" w:before="0"/>
       </w:pPr>
       <w:r>
-        <w:t xml:space="preserve">private boolean degreeMode = false;      // false = радианы, true = градусы</w:t>
+        <w:t xml:space="preserve">private boolean historyDialogWasOpen = false;          // было ли открыто окно истории до поворота</w:t>
       </w:r>
     </w:p>
     <w:p>
@@ -1258,7 +1476,7 @@
         <w:t xml:space="preserve">Ключевая идея:</w:t>
       </w:r>
       <w:r>
-        <w:t xml:space="preserve"> всё, что на экране, строится из этих 5 переменных. Поэтому при повороте достаточно сохранить только их.</w:t>
+        <w:t xml:space="preserve"> всё, что на экране, строится из этих переменных. Поэтому при повороте достаточно сохранить только их.</w:t>
       </w:r>
     </w:p>
     <w:p>
@@ -1311,7 +1529,7 @@
         <w:spacing w:after="0" w:before="0"/>
       </w:pPr>
       <w:r>
-        <w:t xml:space="preserve">    Log.d(TAG, "onCreate");                      // пишем в журнал «onCreate»</w:t>
+        <w:t xml:space="preserve">    Log.d(TAG, "onCreate, savedInstanceState = " + savedInstanceState);</w:t>
       </w:r>
     </w:p>
     <w:p>
@@ -1365,7 +1583,7 @@
         <w:spacing w:after="0" w:before="0"/>
       </w:pPr>
       <w:r>
-        <w:t xml:space="preserve">    setSupportActionBar(toolbar);                // делаем его «шапкой» экрана</w:t>
+        <w:t xml:space="preserve">    setSupportActionBar(toolbar);                // делаем его «шапкой» экрана (там кнопка «История»)</w:t>
       </w:r>
     </w:p>
     <w:p>
@@ -1401,6 +1619,24 @@
         <w:spacing w:after="0" w:before="0"/>
       </w:pPr>
       <w:r>
+        <w:t xml:space="preserve">    historyScroll = findViewById(R.id.history_scroll);    // в альбомной разметке вернёт null</w:t>
+      </w:r>
+    </w:p>
+    <w:p>
+      <w:pPr>
+        <w:pStyle w:val="Code"/>
+        <w:spacing w:after="0" w:before="0"/>
+      </w:pPr>
+      <w:r>
+        <w:t xml:space="preserve">    historyView = findViewById(R.id.history);             // в альбомной разметке вернёт null</w:t>
+      </w:r>
+    </w:p>
+    <w:p>
+      <w:pPr>
+        <w:pStyle w:val="Code"/>
+        <w:spacing w:after="0" w:before="0"/>
+      </w:pPr>
+      <w:r>
         <w:t xml:space="preserve">    ViewGroup keypad = findViewById(R.id.keypad);         // контейнер со всеми кнопками</w:t>
       </w:r>
     </w:p>
@@ -1419,6 +1655,33 @@
         <w:spacing w:after="0" w:before="0"/>
       </w:pPr>
       <w:r>
+        <w:t xml:space="preserve">    if (historyView != null) {                   // проверка на null: поле есть только в портрете</w:t>
+      </w:r>
+    </w:p>
+    <w:p>
+      <w:pPr>
+        <w:pStyle w:val="Code"/>
+        <w:spacing w:after="0" w:before="0"/>
+      </w:pPr>
+      <w:r>
+        <w:t xml:space="preserve">        historyView.setOnClickListener(v -&gt; showHistoryDialog()); // нажали на историю → окно</w:t>
+      </w:r>
+    </w:p>
+    <w:p>
+      <w:pPr>
+        <w:pStyle w:val="Code"/>
+        <w:spacing w:after="0" w:before="0"/>
+      </w:pPr>
+      <w:r>
+        <w:t xml:space="preserve">    }</w:t>
+      </w:r>
+    </w:p>
+    <w:p>
+      <w:pPr>
+        <w:pStyle w:val="Code"/>
+        <w:spacing w:after="0" w:before="0"/>
+      </w:pPr>
+      <w:r>
         <w:t xml:space="preserve">    applySystemBarInsets(findViewById(R.id.main), toolbar, keypad); // отступы от системных панелей</w:t>
       </w:r>
     </w:p>
@@ -1437,7 +1700,88 @@
         <w:spacing w:after="0" w:before="0"/>
       </w:pPr>
       <w:r>
-        <w:t xml:space="preserve">    render();                                    // нарисовать начальное состояние</w:t>
+        <w:t xml:space="preserve"> </w:t>
+      </w:r>
+    </w:p>
+    <w:p>
+      <w:pPr>
+        <w:pStyle w:val="Code"/>
+        <w:spacing w:after="0" w:before="0"/>
+      </w:pPr>
+      <w:r>
+        <w:t xml:space="preserve">    // Первый запуск: savedInstanceState == null, восстанавливать нечего.</w:t>
+      </w:r>
+    </w:p>
+    <w:p>
+      <w:pPr>
+        <w:pStyle w:val="Code"/>
+        <w:spacing w:after="0" w:before="0"/>
+      </w:pPr>
+      <w:r>
+        <w:t xml:space="preserve">    // После поворота: в Bundle лежат данные из onSaveInstanceState.</w:t>
+      </w:r>
+    </w:p>
+    <w:p>
+      <w:pPr>
+        <w:pStyle w:val="Code"/>
+        <w:spacing w:after="0" w:before="0"/>
+      </w:pPr>
+      <w:r>
+        <w:t xml:space="preserve">    if (savedInstanceState != null) {            // ← ПРОВЕРКА НА NULL</w:t>
+      </w:r>
+    </w:p>
+    <w:p>
+      <w:pPr>
+        <w:pStyle w:val="Code"/>
+        <w:spacing w:after="0" w:before="0"/>
+      </w:pPr>
+      <w:r>
+        <w:t xml:space="preserve">        restoreState(savedInstanceState);        // достаём данные из Bundle</w:t>
+      </w:r>
+    </w:p>
+    <w:p>
+      <w:pPr>
+        <w:pStyle w:val="Code"/>
+        <w:spacing w:after="0" w:before="0"/>
+      </w:pPr>
+      <w:r>
+        <w:t xml:space="preserve">    }</w:t>
+      </w:r>
+    </w:p>
+    <w:p>
+      <w:pPr>
+        <w:pStyle w:val="Code"/>
+        <w:spacing w:after="0" w:before="0"/>
+      </w:pPr>
+      <w:r>
+        <w:t xml:space="preserve">    render();                                    // нарисовать состояние на экране</w:t>
+      </w:r>
+    </w:p>
+    <w:p>
+      <w:pPr>
+        <w:pStyle w:val="Code"/>
+        <w:spacing w:after="0" w:before="0"/>
+      </w:pPr>
+      <w:r>
+        <w:t xml:space="preserve">    if (historyDialogWasOpen) {</w:t>
+      </w:r>
+    </w:p>
+    <w:p>
+      <w:pPr>
+        <w:pStyle w:val="Code"/>
+        <w:spacing w:after="0" w:before="0"/>
+      </w:pPr>
+      <w:r>
+        <w:t xml:space="preserve">        showHistoryDialog();                     // окно истории было открыто — открыть снова</w:t>
+      </w:r>
+    </w:p>
+    <w:p>
+      <w:pPr>
+        <w:pStyle w:val="Code"/>
+        <w:spacing w:after="0" w:before="0"/>
+      </w:pPr>
+      <w:r>
+        <w:t xml:space="preserve">    }</w:t>
       </w:r>
     </w:p>
     <w:p>
@@ -2720,6 +3064,15 @@
         <w:spacing w:after="0" w:before="0"/>
       </w:pPr>
       <w:r>
+        <w:t xml:space="preserve">        addToHistory(getString(R.string.history_entry, expression, result)); // в историю: "2+3 = 5"</w:t>
+      </w:r>
+    </w:p>
+    <w:p>
+      <w:pPr>
+        <w:pStyle w:val="Code"/>
+        <w:spacing w:after="0" w:before="0"/>
+      </w:pPr>
+      <w:r>
         <w:t xml:space="preserve">    } catch (CalculationException e) {           // если вычислитель сообщил об ошибке —</w:t>
       </w:r>
     </w:p>
@@ -3022,6 +3375,60 @@
     <w:p>
       <w:pPr>
         <w:pStyle w:val="Code"/>
+        <w:spacing w:after="0" w:before="0"/>
+      </w:pPr>
+      <w:r>
+        <w:t xml:space="preserve"> </w:t>
+      </w:r>
+    </w:p>
+    <w:p>
+      <w:pPr>
+        <w:pStyle w:val="Code"/>
+        <w:spacing w:after="0" w:before="0"/>
+      </w:pPr>
+      <w:r>
+        <w:t xml:space="preserve">    // В альбомной разметке поля истории нет — findViewById вернул null, поэтому проверяем</w:t>
+      </w:r>
+    </w:p>
+    <w:p>
+      <w:pPr>
+        <w:pStyle w:val="Code"/>
+        <w:spacing w:after="0" w:before="0"/>
+      </w:pPr>
+      <w:r>
+        <w:t xml:space="preserve">    if (historyView != null &amp;&amp; historyScroll != null) {</w:t>
+      </w:r>
+    </w:p>
+    <w:p>
+      <w:pPr>
+        <w:pStyle w:val="Code"/>
+        <w:spacing w:after="0" w:before="0"/>
+      </w:pPr>
+      <w:r>
+        <w:t xml:space="preserve">        historyView.setText(TextUtils.join("\n", history));       // записи через перенос строки</w:t>
+      </w:r>
+    </w:p>
+    <w:p>
+      <w:pPr>
+        <w:pStyle w:val="Code"/>
+        <w:spacing w:after="0" w:before="0"/>
+      </w:pPr>
+      <w:r>
+        <w:t xml:space="preserve">        historyScroll.post(() -&gt; historyScroll.fullScroll(View.FOCUS_DOWN)); // к последней записи</w:t>
+      </w:r>
+    </w:p>
+    <w:p>
+      <w:pPr>
+        <w:pStyle w:val="Code"/>
+        <w:spacing w:after="0" w:before="0"/>
+      </w:pPr>
+      <w:r>
+        <w:t xml:space="preserve">    }</w:t>
+      </w:r>
+    </w:p>
+    <w:p>
+      <w:pPr>
+        <w:pStyle w:val="Code"/>
         <w:spacing w:after="120" w:before="0"/>
       </w:pPr>
       <w:r>
@@ -3167,16 +3574,7 @@
         <w:spacing w:after="0" w:before="0"/>
       </w:pPr>
       <w:r>
-        <w:t xml:space="preserve">    super.onSaveInstanceState(outState);           // родитель сохраняет своё</w:t>
-      </w:r>
-    </w:p>
-    <w:p>
-      <w:pPr>
-        <w:pStyle w:val="Code"/>
-        <w:spacing w:after="0" w:before="0"/>
-      </w:pPr>
-      <w:r>
-        <w:t xml:space="preserve">    Log.d(TAG, "onSaveInstanceState: " + expression);</w:t>
+        <w:t xml:space="preserve">    super.onSaveInstanceState(outState);               // родитель сохраняет своё</w:t>
       </w:r>
     </w:p>
     <w:p>
@@ -3230,6 +3628,42 @@
         <w:spacing w:after="0" w:before="0"/>
       </w:pPr>
       <w:r>
+        <w:t xml:space="preserve">    outState.putStringArrayList(KEY_HISTORY, history); // ИСТОРИЯ: список строк ArrayList&lt;String&gt;</w:t>
+      </w:r>
+    </w:p>
+    <w:p>
+      <w:pPr>
+        <w:pStyle w:val="Code"/>
+        <w:spacing w:after="0" w:before="0"/>
+      </w:pPr>
+      <w:r>
+        <w:t xml:space="preserve">    outState.putBoolean(KEY_HISTORY_DIALOG_OPEN,       // открыто ли окно истории</w:t>
+      </w:r>
+    </w:p>
+    <w:p>
+      <w:pPr>
+        <w:pStyle w:val="Code"/>
+        <w:spacing w:after="0" w:before="0"/>
+      </w:pPr>
+      <w:r>
+        <w:t xml:space="preserve">            historyDialog != null &amp;&amp; historyDialog.isShowing()); // сначала проверка на null</w:t>
+      </w:r>
+    </w:p>
+    <w:p>
+      <w:pPr>
+        <w:pStyle w:val="Code"/>
+        <w:spacing w:after="0" w:before="0"/>
+      </w:pPr>
+      <w:r>
+        <w:t xml:space="preserve">    Log.d(TAG, "onSaveInstanceState: " + outState);</w:t>
+      </w:r>
+    </w:p>
+    <w:p>
+      <w:pPr>
+        <w:pStyle w:val="Code"/>
+        <w:spacing w:after="0" w:before="0"/>
+      </w:pPr>
+      <w:r>
         <w:t xml:space="preserve">}</w:t>
       </w:r>
     </w:p>
@@ -3248,6 +3682,141 @@
         <w:spacing w:after="0" w:before="0"/>
       </w:pPr>
       <w:r>
+        <w:t xml:space="preserve">/** Достаёт данные из Bundle. Вызывается из onCreate, только если Bundle не null. */</w:t>
+      </w:r>
+    </w:p>
+    <w:p>
+      <w:pPr>
+        <w:pStyle w:val="Code"/>
+        <w:spacing w:after="0" w:before="0"/>
+      </w:pPr>
+      <w:r>
+        <w:t xml:space="preserve">private void restoreState(@NonNull Bundle state) {</w:t>
+      </w:r>
+    </w:p>
+    <w:p>
+      <w:pPr>
+        <w:pStyle w:val="Code"/>
+        <w:spacing w:after="0" w:before="0"/>
+      </w:pPr>
+      <w:r>
+        <w:t xml:space="preserve">    expression = state.getString(KEY_EXPRESSION, "");  // "" — значение по умолчанию</w:t>
+      </w:r>
+    </w:p>
+    <w:p>
+      <w:pPr>
+        <w:pStyle w:val="Code"/>
+        <w:spacing w:after="0" w:before="0"/>
+      </w:pPr>
+      <w:r>
+        <w:t xml:space="preserve">    result = state.getString(KEY_RESULT, "");</w:t>
+      </w:r>
+    </w:p>
+    <w:p>
+      <w:pPr>
+        <w:pStyle w:val="Code"/>
+        <w:spacing w:after="0" w:before="0"/>
+      </w:pPr>
+      <w:r>
+        <w:t xml:space="preserve">    resultIsError = state.getBoolean(KEY_RESULT_IS_ERROR, false);</w:t>
+      </w:r>
+    </w:p>
+    <w:p>
+      <w:pPr>
+        <w:pStyle w:val="Code"/>
+        <w:spacing w:after="0" w:before="0"/>
+      </w:pPr>
+      <w:r>
+        <w:t xml:space="preserve">    justEvaluated = state.getBoolean(KEY_JUST_EVALUATED, false);</w:t>
+      </w:r>
+    </w:p>
+    <w:p>
+      <w:pPr>
+        <w:pStyle w:val="Code"/>
+        <w:spacing w:after="0" w:before="0"/>
+      </w:pPr>
+      <w:r>
+        <w:t xml:space="preserve">    degreeMode = state.getBoolean(KEY_DEGREE_MODE, false);</w:t>
+      </w:r>
+    </w:p>
+    <w:p>
+      <w:pPr>
+        <w:pStyle w:val="Code"/>
+        <w:spacing w:after="0" w:before="0"/>
+      </w:pPr>
+      <w:r>
+        <w:t xml:space="preserve">    ArrayList&lt;String&gt; savedHistory = state.getStringArrayList(KEY_HISTORY);</w:t>
+      </w:r>
+    </w:p>
+    <w:p>
+      <w:pPr>
+        <w:pStyle w:val="Code"/>
+        <w:spacing w:after="0" w:before="0"/>
+      </w:pPr>
+      <w:r>
+        <w:t xml:space="preserve">    if (savedHistory != null) {        // getStringArrayList вернёт null, если ключа нет</w:t>
+      </w:r>
+    </w:p>
+    <w:p>
+      <w:pPr>
+        <w:pStyle w:val="Code"/>
+        <w:spacing w:after="0" w:before="0"/>
+      </w:pPr>
+      <w:r>
+        <w:t xml:space="preserve">        history = savedHistory;</w:t>
+      </w:r>
+    </w:p>
+    <w:p>
+      <w:pPr>
+        <w:pStyle w:val="Code"/>
+        <w:spacing w:after="0" w:before="0"/>
+      </w:pPr>
+      <w:r>
+        <w:t xml:space="preserve">    }</w:t>
+      </w:r>
+    </w:p>
+    <w:p>
+      <w:pPr>
+        <w:pStyle w:val="Code"/>
+        <w:spacing w:after="0" w:before="0"/>
+      </w:pPr>
+      <w:r>
+        <w:t xml:space="preserve">    historyDialogWasOpen = state.getBoolean(KEY_HISTORY_DIALOG_OPEN, false);</w:t>
+      </w:r>
+    </w:p>
+    <w:p>
+      <w:pPr>
+        <w:pStyle w:val="Code"/>
+        <w:spacing w:after="0" w:before="0"/>
+      </w:pPr>
+      <w:r>
+        <w:t xml:space="preserve">    Log.d(TAG, "restoreState: expression = " + expression + ", history = " + history.size());</w:t>
+      </w:r>
+    </w:p>
+    <w:p>
+      <w:pPr>
+        <w:pStyle w:val="Code"/>
+        <w:spacing w:after="0" w:before="0"/>
+      </w:pPr>
+      <w:r>
+        <w:t xml:space="preserve">}</w:t>
+      </w:r>
+    </w:p>
+    <w:p>
+      <w:pPr>
+        <w:pStyle w:val="Code"/>
+        <w:spacing w:after="0" w:before="0"/>
+      </w:pPr>
+      <w:r>
+        <w:t xml:space="preserve"> </w:t>
+      </w:r>
+    </w:p>
+    <w:p>
+      <w:pPr>
+        <w:pStyle w:val="Code"/>
+        <w:spacing w:after="0" w:before="0"/>
+      </w:pPr>
+      <w:r>
         <w:t xml:space="preserve">@Override</w:t>
       </w:r>
     </w:p>
@@ -3266,6 +3835,24 @@
         <w:spacing w:after="0" w:before="0"/>
       </w:pPr>
       <w:r>
+        <w:t xml:space="preserve">    // Второе место, где можно восстанавливать (Bundle здесь никогда не null).</w:t>
+      </w:r>
+    </w:p>
+    <w:p>
+      <w:pPr>
+        <w:pStyle w:val="Code"/>
+        <w:spacing w:after="0" w:before="0"/>
+      </w:pPr>
+      <w:r>
+        <w:t xml:space="preserve">    // Мы восстановили всё в onCreate, здесь только лог — видно порядок вызовов.</w:t>
+      </w:r>
+    </w:p>
+    <w:p>
+      <w:pPr>
+        <w:pStyle w:val="Code"/>
+        <w:spacing w:after="0" w:before="0"/>
+      </w:pPr>
+      <w:r>
         <w:t xml:space="preserve">    super.onRestoreInstanceState(savedInstanceState);</w:t>
       </w:r>
     </w:p>
@@ -3275,61 +3862,7 @@
         <w:spacing w:after="0" w:before="0"/>
       </w:pPr>
       <w:r>
-        <w:t xml:space="preserve">    expression = savedInstanceState.getString(KEY_EXPRESSION, ""); // достаём по ключу,</w:t>
-      </w:r>
-    </w:p>
-    <w:p>
-      <w:pPr>
-        <w:pStyle w:val="Code"/>
-        <w:spacing w:after="0" w:before="0"/>
-      </w:pPr>
-      <w:r>
-        <w:t xml:space="preserve">    result = savedInstanceState.getString(KEY_RESULT, "");         // "" — если ничего нет</w:t>
-      </w:r>
-    </w:p>
-    <w:p>
-      <w:pPr>
-        <w:pStyle w:val="Code"/>
-        <w:spacing w:after="0" w:before="0"/>
-      </w:pPr>
-      <w:r>
-        <w:t xml:space="preserve">    resultIsError = savedInstanceState.getBoolean(KEY_RESULT_IS_ERROR);</w:t>
-      </w:r>
-    </w:p>
-    <w:p>
-      <w:pPr>
-        <w:pStyle w:val="Code"/>
-        <w:spacing w:after="0" w:before="0"/>
-      </w:pPr>
-      <w:r>
-        <w:t xml:space="preserve">    justEvaluated = savedInstanceState.getBoolean(KEY_JUST_EVALUATED);</w:t>
-      </w:r>
-    </w:p>
-    <w:p>
-      <w:pPr>
-        <w:pStyle w:val="Code"/>
-        <w:spacing w:after="0" w:before="0"/>
-      </w:pPr>
-      <w:r>
-        <w:t xml:space="preserve">    degreeMode = savedInstanceState.getBoolean(KEY_DEGREE_MODE);</w:t>
-      </w:r>
-    </w:p>
-    <w:p>
-      <w:pPr>
-        <w:pStyle w:val="Code"/>
-        <w:spacing w:after="0" w:before="0"/>
-      </w:pPr>
-      <w:r>
-        <w:t xml:space="preserve">    Log.d(TAG, "onRestoreInstanceState: " + expression);</w:t>
-      </w:r>
-    </w:p>
-    <w:p>
-      <w:pPr>
-        <w:pStyle w:val="Code"/>
-        <w:spacing w:after="0" w:before="0"/>
-      </w:pPr>
-      <w:r>
-        <w:t xml:space="preserve">    render();                                      // показать восстановленное</w:t>
+        <w:t xml:space="preserve">    Log.d(TAG, "onRestoreInstanceState");</w:t>
       </w:r>
     </w:p>
     <w:p>
@@ -3342,10 +3875,322 @@
       </w:r>
     </w:p>
     <w:p>
+      <w:r>
+        <w:t xml:space="preserve">Подробно о Bundle, проверках на null и истории — в отдельном документе «Сохранение данных при повороте, история и XML-разметки» (</w:t>
+      </w:r>
+      <w:r>
+        <w:rPr>
+          <w:rFonts w:ascii="Consolas" w:cs="Consolas" w:eastAsia="Consolas" w:hAnsi="Consolas"/>
+          <w:color w:val="4A2A6A"/>
+          <w:sz w:val="21"/>
+          <w:szCs w:val="21"/>
+        </w:rPr>
+        <w:t xml:space="preserve">docs/state-history-layouts.md</w:t>
+      </w:r>
+      <w:r>
+        <w:t xml:space="preserve">).</w:t>
+      </w:r>
+    </w:p>
+    <w:p>
       <w:pPr>
         <w:pStyle w:val="Heading2"/>
       </w:pPr>
       <w:r>
+        <w:t xml:space="preserve">История вычислений</w:t>
+      </w:r>
+    </w:p>
+    <w:p>
+      <w:pPr>
+        <w:pStyle w:val="Code"/>
+        <w:spacing w:after="0" w:before="80"/>
+      </w:pPr>
+      <w:r>
+        <w:t xml:space="preserve">private void addToHistory(String entry) {</w:t>
+      </w:r>
+    </w:p>
+    <w:p>
+      <w:pPr>
+        <w:pStyle w:val="Code"/>
+        <w:spacing w:after="0" w:before="0"/>
+      </w:pPr>
+      <w:r>
+        <w:t xml:space="preserve">    int size = history.size();</w:t>
+      </w:r>
+    </w:p>
+    <w:p>
+      <w:pPr>
+        <w:pStyle w:val="Code"/>
+        <w:spacing w:after="0" w:before="0"/>
+      </w:pPr>
+      <w:r>
+        <w:t xml:space="preserve">    if (size &gt; 0 &amp;&amp; history.get(size - 1).equals(entry)) {</w:t>
+      </w:r>
+    </w:p>
+    <w:p>
+      <w:pPr>
+        <w:pStyle w:val="Code"/>
+        <w:spacing w:after="0" w:before="0"/>
+      </w:pPr>
+      <w:r>
+        <w:t xml:space="preserve">        return;                    // повторное нажатие "=" не дублирует запись</w:t>
+      </w:r>
+    </w:p>
+    <w:p>
+      <w:pPr>
+        <w:pStyle w:val="Code"/>
+        <w:spacing w:after="0" w:before="0"/>
+      </w:pPr>
+      <w:r>
+        <w:t xml:space="preserve">    }</w:t>
+      </w:r>
+    </w:p>
+    <w:p>
+      <w:pPr>
+        <w:pStyle w:val="Code"/>
+        <w:spacing w:after="0" w:before="0"/>
+      </w:pPr>
+      <w:r>
+        <w:t xml:space="preserve">    history.add(entry);            // добавляем в конец</w:t>
+      </w:r>
+    </w:p>
+    <w:p>
+      <w:pPr>
+        <w:pStyle w:val="Code"/>
+        <w:spacing w:after="0" w:before="0"/>
+      </w:pPr>
+      <w:r>
+        <w:t xml:space="preserve">    if (history.size() &gt; MAX_HISTORY) {</w:t>
+      </w:r>
+    </w:p>
+    <w:p>
+      <w:pPr>
+        <w:pStyle w:val="Code"/>
+        <w:spacing w:after="0" w:before="0"/>
+      </w:pPr>
+      <w:r>
+        <w:t xml:space="preserve">        history.remove(0);         // самые старые удаляем</w:t>
+      </w:r>
+    </w:p>
+    <w:p>
+      <w:pPr>
+        <w:pStyle w:val="Code"/>
+        <w:spacing w:after="0" w:before="0"/>
+      </w:pPr>
+      <w:r>
+        <w:t xml:space="preserve">    }</w:t>
+      </w:r>
+    </w:p>
+    <w:p>
+      <w:pPr>
+        <w:pStyle w:val="Code"/>
+        <w:spacing w:after="0" w:before="0"/>
+      </w:pPr>
+      <w:r>
+        <w:t xml:space="preserve">}</w:t>
+      </w:r>
+    </w:p>
+    <w:p>
+      <w:pPr>
+        <w:pStyle w:val="Code"/>
+        <w:spacing w:after="0" w:before="0"/>
+      </w:pPr>
+      <w:r>
+        <w:t xml:space="preserve"> </w:t>
+      </w:r>
+    </w:p>
+    <w:p>
+      <w:pPr>
+        <w:pStyle w:val="Code"/>
+        <w:spacing w:after="0" w:before="0"/>
+      </w:pPr>
+      <w:r>
+        <w:t xml:space="preserve">@Override</w:t>
+      </w:r>
+    </w:p>
+    <w:p>
+      <w:pPr>
+        <w:pStyle w:val="Code"/>
+        <w:spacing w:after="0" w:before="0"/>
+      </w:pPr>
+      <w:r>
+        <w:t xml:space="preserve">public boolean onCreateOptionsMenu(Menu menu) {             // создать меню верхней панели</w:t>
+      </w:r>
+    </w:p>
+    <w:p>
+      <w:pPr>
+        <w:pStyle w:val="Code"/>
+        <w:spacing w:after="0" w:before="0"/>
+      </w:pPr>
+      <w:r>
+        <w:t xml:space="preserve">    getMenuInflater().inflate(R.menu.main_menu, menu);       // из res/menu/main_menu.xml</w:t>
+      </w:r>
+    </w:p>
+    <w:p>
+      <w:pPr>
+        <w:pStyle w:val="Code"/>
+        <w:spacing w:after="0" w:before="0"/>
+      </w:pPr>
+      <w:r>
+        <w:t xml:space="preserve">    return true;</w:t>
+      </w:r>
+    </w:p>
+    <w:p>
+      <w:pPr>
+        <w:pStyle w:val="Code"/>
+        <w:spacing w:after="0" w:before="0"/>
+      </w:pPr>
+      <w:r>
+        <w:t xml:space="preserve">}</w:t>
+      </w:r>
+    </w:p>
+    <w:p>
+      <w:pPr>
+        <w:pStyle w:val="Code"/>
+        <w:spacing w:after="0" w:before="0"/>
+      </w:pPr>
+      <w:r>
+        <w:t xml:space="preserve"> </w:t>
+      </w:r>
+    </w:p>
+    <w:p>
+      <w:pPr>
+        <w:pStyle w:val="Code"/>
+        <w:spacing w:after="0" w:before="0"/>
+      </w:pPr>
+      <w:r>
+        <w:t xml:space="preserve">@Override</w:t>
+      </w:r>
+    </w:p>
+    <w:p>
+      <w:pPr>
+        <w:pStyle w:val="Code"/>
+        <w:spacing w:after="0" w:before="0"/>
+      </w:pPr>
+      <w:r>
+        <w:t xml:space="preserve">public boolean onOptionsItemSelected(@NonNull MenuItem item) { // нажали пункт меню</w:t>
+      </w:r>
+    </w:p>
+    <w:p>
+      <w:pPr>
+        <w:pStyle w:val="Code"/>
+        <w:spacing w:after="0" w:before="0"/>
+      </w:pPr>
+      <w:r>
+        <w:t xml:space="preserve">    if (item.getItemId() == R.id.action_history) {</w:t>
+      </w:r>
+    </w:p>
+    <w:p>
+      <w:pPr>
+        <w:pStyle w:val="Code"/>
+        <w:spacing w:after="0" w:before="0"/>
+      </w:pPr>
+      <w:r>
+        <w:t xml:space="preserve">        showHistoryDialog();                                   // показать окно истории</w:t>
+      </w:r>
+    </w:p>
+    <w:p>
+      <w:pPr>
+        <w:pStyle w:val="Code"/>
+        <w:spacing w:after="0" w:before="0"/>
+      </w:pPr>
+      <w:r>
+        <w:t xml:space="preserve">        return true;</w:t>
+      </w:r>
+    </w:p>
+    <w:p>
+      <w:pPr>
+        <w:pStyle w:val="Code"/>
+        <w:spacing w:after="0" w:before="0"/>
+      </w:pPr>
+      <w:r>
+        <w:t xml:space="preserve">    }</w:t>
+      </w:r>
+    </w:p>
+    <w:p>
+      <w:pPr>
+        <w:pStyle w:val="Code"/>
+        <w:spacing w:after="0" w:before="0"/>
+      </w:pPr>
+      <w:r>
+        <w:t xml:space="preserve">    return super.onOptionsItemSelected(item);</w:t>
+      </w:r>
+    </w:p>
+    <w:p>
+      <w:pPr>
+        <w:pStyle w:val="Code"/>
+        <w:spacing w:after="120" w:before="0"/>
+      </w:pPr>
+      <w:r>
+        <w:t xml:space="preserve">}</w:t>
+      </w:r>
+    </w:p>
+    <w:p>
+      <w:r>
+        <w:rPr>
+          <w:rFonts w:ascii="Consolas" w:cs="Consolas" w:eastAsia="Consolas" w:hAnsi="Consolas"/>
+          <w:color w:val="4A2A6A"/>
+          <w:sz w:val="21"/>
+          <w:szCs w:val="21"/>
+        </w:rPr>
+        <w:t xml:space="preserve">showHistoryDialog()</w:t>
+      </w:r>
+      <w:r>
+        <w:t xml:space="preserve"> строит окно </w:t>
+      </w:r>
+      <w:r>
+        <w:rPr>
+          <w:rFonts w:ascii="Consolas" w:cs="Consolas" w:eastAsia="Consolas" w:hAnsi="Consolas"/>
+          <w:color w:val="4A2A6A"/>
+          <w:sz w:val="21"/>
+          <w:szCs w:val="21"/>
+        </w:rPr>
+        <w:t xml:space="preserve">MaterialAlertDialogBuilder</w:t>
+      </w:r>
+      <w:r>
+        <w:t xml:space="preserve"> со списком записей (новые сверху), кнопками «Очистить» и «Закрыть». Нажатие на запись вызывает </w:t>
+      </w:r>
+      <w:r>
+        <w:rPr>
+          <w:rFonts w:ascii="Consolas" w:cs="Consolas" w:eastAsia="Consolas" w:hAnsi="Consolas"/>
+          <w:color w:val="4A2A6A"/>
+          <w:sz w:val="21"/>
+          <w:szCs w:val="21"/>
+        </w:rPr>
+        <w:t xml:space="preserve">useHistoryEntry(...)</w:t>
+      </w:r>
+      <w:r>
+        <w:t xml:space="preserve">: выражение из записи (</w:t>
+      </w:r>
+      <w:r>
+        <w:rPr>
+          <w:rFonts w:ascii="Consolas" w:cs="Consolas" w:eastAsia="Consolas" w:hAnsi="Consolas"/>
+          <w:color w:val="4A2A6A"/>
+          <w:sz w:val="21"/>
+          <w:szCs w:val="21"/>
+        </w:rPr>
+        <w:t xml:space="preserve">"2+3 = 5"</w:t>
+      </w:r>
+      <w:r>
+        <w:t xml:space="preserve"> → </w:t>
+      </w:r>
+      <w:r>
+        <w:rPr>
+          <w:rFonts w:ascii="Consolas" w:cs="Consolas" w:eastAsia="Consolas" w:hAnsi="Consolas"/>
+          <w:color w:val="4A2A6A"/>
+          <w:sz w:val="21"/>
+          <w:szCs w:val="21"/>
+        </w:rPr>
+        <w:t xml:space="preserve">"2+3"</w:t>
+      </w:r>
+      <w:r>
+        <w:t xml:space="preserve">) возвращается в поле ввода.</w:t>
+      </w:r>
+    </w:p>
+    <w:p>
+      <w:pPr>
+        <w:pStyle w:val="Heading2"/>
+      </w:pPr>
+      <w:r>
         <w:t xml:space="preserve">Методы жизненного цикла</w:t>
       </w:r>
     </w:p>
@@ -3392,6 +4237,47 @@
       </w:pPr>
       <w:r>
         <w:t xml:space="preserve">@Override protected void onDestroy() { super.onDestroy(); Log.d(TAG, "onDestroy"); } // уничтожается</w:t>
+      </w:r>
+    </w:p>
+    <w:p>
+      <w:r>
+        <w:t xml:space="preserve">В </w:t>
+      </w:r>
+      <w:r>
+        <w:rPr>
+          <w:rFonts w:ascii="Consolas" w:cs="Consolas" w:eastAsia="Consolas" w:hAnsi="Consolas"/>
+          <w:color w:val="4A2A6A"/>
+          <w:sz w:val="21"/>
+          <w:szCs w:val="21"/>
+        </w:rPr>
+        <w:t xml:space="preserve">onDestroy</w:t>
+      </w:r>
+      <w:r>
+        <w:t xml:space="preserve"> перед </w:t>
+      </w:r>
+      <w:r>
+        <w:rPr>
+          <w:rFonts w:ascii="Consolas" w:cs="Consolas" w:eastAsia="Consolas" w:hAnsi="Consolas"/>
+          <w:color w:val="4A2A6A"/>
+          <w:sz w:val="21"/>
+          <w:szCs w:val="21"/>
+        </w:rPr>
+        <w:t xml:space="preserve">super.onDestroy()</w:t>
+      </w:r>
+      <w:r>
+        <w:t xml:space="preserve"> ещё закрывается окно истории: </w:t>
+      </w:r>
+      <w:r>
+        <w:rPr>
+          <w:rFonts w:ascii="Consolas" w:cs="Consolas" w:eastAsia="Consolas" w:hAnsi="Consolas"/>
+          <w:color w:val="4A2A6A"/>
+          <w:sz w:val="21"/>
+          <w:szCs w:val="21"/>
+        </w:rPr>
+        <w:t xml:space="preserve">if (historyDialog != null) historyDialog.dismiss();</w:t>
+      </w:r>
+      <w:r>
+        <w:t xml:space="preserve">. Иначе при повороте окно «утечёт» вместе со старой Activity (ошибка WindowLeaked в Logcat).</w:t>
       </w:r>
     </w:p>
     <w:p>
@@ -7002,8 +7888,8 @@
         </w:tblBorders>
       </w:tblPr>
       <w:tblGrid>
-        <w:gridCol w:w="3987"/>
-        <w:gridCol w:w="5935"/>
+        <w:gridCol w:w="4042"/>
+        <w:gridCol w:w="5880"/>
       </w:tblGrid>
       <w:tr>
         <w:trPr>
@@ -7012,7 +7898,7 @@
         </w:trPr>
         <w:tc>
           <w:tcPr>
-            <w:tcW w:type="dxa" w:w="3987"/>
+            <w:tcW w:type="dxa" w:w="4042"/>
             <w:tcBorders>
               <w:top w:val="single" w:color="A893BC" w:sz="4"/>
               <w:left w:val="single" w:color="A893BC" w:sz="4"/>
@@ -7042,7 +7928,7 @@
         </w:tc>
         <w:tc>
           <w:tcPr>
-            <w:tcW w:type="dxa" w:w="5935"/>
+            <w:tcW w:type="dxa" w:w="5880"/>
             <w:tcBorders>
               <w:top w:val="single" w:color="A893BC" w:sz="4"/>
               <w:left w:val="single" w:color="A893BC" w:sz="4"/>
@@ -7078,7 +7964,7 @@
         </w:trPr>
         <w:tc>
           <w:tcPr>
-            <w:tcW w:type="dxa" w:w="3987"/>
+            <w:tcW w:type="dxa" w:w="4042"/>
             <w:tcBorders>
               <w:top w:val="single" w:color="A893BC" w:sz="4"/>
               <w:left w:val="single" w:color="A893BC" w:sz="4"/>
@@ -7103,7 +7989,7 @@
         </w:tc>
         <w:tc>
           <w:tcPr>
-            <w:tcW w:type="dxa" w:w="5935"/>
+            <w:tcW w:type="dxa" w:w="5880"/>
             <w:tcBorders>
               <w:top w:val="single" w:color="A893BC" w:sz="4"/>
               <w:left w:val="single" w:color="A893BC" w:sz="4"/>
@@ -7134,7 +8020,7 @@
         </w:trPr>
         <w:tc>
           <w:tcPr>
-            <w:tcW w:type="dxa" w:w="3987"/>
+            <w:tcW w:type="dxa" w:w="4042"/>
             <w:tcBorders>
               <w:top w:val="single" w:color="A893BC" w:sz="4"/>
               <w:left w:val="single" w:color="A893BC" w:sz="4"/>
@@ -7159,7 +8045,7 @@
         </w:tc>
         <w:tc>
           <w:tcPr>
-            <w:tcW w:type="dxa" w:w="5935"/>
+            <w:tcW w:type="dxa" w:w="5880"/>
             <w:tcBorders>
               <w:top w:val="single" w:color="A893BC" w:sz="4"/>
               <w:left w:val="single" w:color="A893BC" w:sz="4"/>
@@ -7190,7 +8076,7 @@
         </w:trPr>
         <w:tc>
           <w:tcPr>
-            <w:tcW w:type="dxa" w:w="3987"/>
+            <w:tcW w:type="dxa" w:w="4042"/>
             <w:tcBorders>
               <w:top w:val="single" w:color="A893BC" w:sz="4"/>
               <w:left w:val="single" w:color="A893BC" w:sz="4"/>
@@ -7215,7 +8101,7 @@
         </w:tc>
         <w:tc>
           <w:tcPr>
-            <w:tcW w:type="dxa" w:w="5935"/>
+            <w:tcW w:type="dxa" w:w="5880"/>
             <w:tcBorders>
               <w:top w:val="single" w:color="A893BC" w:sz="4"/>
               <w:left w:val="single" w:color="A893BC" w:sz="4"/>
@@ -7246,7 +8132,7 @@
         </w:trPr>
         <w:tc>
           <w:tcPr>
-            <w:tcW w:type="dxa" w:w="3987"/>
+            <w:tcW w:type="dxa" w:w="4042"/>
             <w:tcBorders>
               <w:top w:val="single" w:color="A893BC" w:sz="4"/>
               <w:left w:val="single" w:color="A893BC" w:sz="4"/>
@@ -7271,7 +8157,7 @@
         </w:tc>
         <w:tc>
           <w:tcPr>
-            <w:tcW w:type="dxa" w:w="5935"/>
+            <w:tcW w:type="dxa" w:w="5880"/>
             <w:tcBorders>
               <w:top w:val="single" w:color="A893BC" w:sz="4"/>
               <w:left w:val="single" w:color="A893BC" w:sz="4"/>
@@ -7302,7 +8188,7 @@
         </w:trPr>
         <w:tc>
           <w:tcPr>
-            <w:tcW w:type="dxa" w:w="3987"/>
+            <w:tcW w:type="dxa" w:w="4042"/>
             <w:tcBorders>
               <w:top w:val="single" w:color="A893BC" w:sz="4"/>
               <w:left w:val="single" w:color="A893BC" w:sz="4"/>
@@ -7327,7 +8213,7 @@
         </w:tc>
         <w:tc>
           <w:tcPr>
-            <w:tcW w:type="dxa" w:w="5935"/>
+            <w:tcW w:type="dxa" w:w="5880"/>
             <w:tcBorders>
               <w:top w:val="single" w:color="A893BC" w:sz="4"/>
               <w:left w:val="single" w:color="A893BC" w:sz="4"/>
@@ -7358,7 +8244,7 @@
         </w:trPr>
         <w:tc>
           <w:tcPr>
-            <w:tcW w:type="dxa" w:w="3987"/>
+            <w:tcW w:type="dxa" w:w="4042"/>
             <w:tcBorders>
               <w:top w:val="single" w:color="A893BC" w:sz="4"/>
               <w:left w:val="single" w:color="A893BC" w:sz="4"/>
@@ -7383,7 +8269,7 @@
         </w:tc>
         <w:tc>
           <w:tcPr>
-            <w:tcW w:type="dxa" w:w="5935"/>
+            <w:tcW w:type="dxa" w:w="5880"/>
             <w:tcBorders>
               <w:top w:val="single" w:color="A893BC" w:sz="4"/>
               <w:left w:val="single" w:color="A893BC" w:sz="4"/>
@@ -7438,7 +8324,7 @@
         </w:trPr>
         <w:tc>
           <w:tcPr>
-            <w:tcW w:type="dxa" w:w="3987"/>
+            <w:tcW w:type="dxa" w:w="4042"/>
             <w:tcBorders>
               <w:top w:val="single" w:color="A893BC" w:sz="4"/>
               <w:left w:val="single" w:color="A893BC" w:sz="4"/>
@@ -7463,7 +8349,7 @@
         </w:tc>
         <w:tc>
           <w:tcPr>
-            <w:tcW w:type="dxa" w:w="5935"/>
+            <w:tcW w:type="dxa" w:w="5880"/>
             <w:tcBorders>
               <w:top w:val="single" w:color="A893BC" w:sz="4"/>
               <w:left w:val="single" w:color="A893BC" w:sz="4"/>
@@ -7494,7 +8380,7 @@
         </w:trPr>
         <w:tc>
           <w:tcPr>
-            <w:tcW w:type="dxa" w:w="3987"/>
+            <w:tcW w:type="dxa" w:w="4042"/>
             <w:tcBorders>
               <w:top w:val="single" w:color="A893BC" w:sz="4"/>
               <w:left w:val="single" w:color="A893BC" w:sz="4"/>
@@ -7519,7 +8405,7 @@
         </w:tc>
         <w:tc>
           <w:tcPr>
-            <w:tcW w:type="dxa" w:w="5935"/>
+            <w:tcW w:type="dxa" w:w="5880"/>
             <w:tcBorders>
               <w:top w:val="single" w:color="A893BC" w:sz="4"/>
               <w:left w:val="single" w:color="A893BC" w:sz="4"/>
@@ -7562,7 +8448,7 @@
         </w:trPr>
         <w:tc>
           <w:tcPr>
-            <w:tcW w:type="dxa" w:w="3987"/>
+            <w:tcW w:type="dxa" w:w="4042"/>
             <w:tcBorders>
               <w:top w:val="single" w:color="A893BC" w:sz="4"/>
               <w:left w:val="single" w:color="A893BC" w:sz="4"/>
@@ -7587,7 +8473,7 @@
         </w:tc>
         <w:tc>
           <w:tcPr>
-            <w:tcW w:type="dxa" w:w="5935"/>
+            <w:tcW w:type="dxa" w:w="5880"/>
             <w:tcBorders>
               <w:top w:val="single" w:color="A893BC" w:sz="4"/>
               <w:left w:val="single" w:color="A893BC" w:sz="4"/>
@@ -7618,7 +8504,7 @@
         </w:trPr>
         <w:tc>
           <w:tcPr>
-            <w:tcW w:type="dxa" w:w="3987"/>
+            <w:tcW w:type="dxa" w:w="4042"/>
             <w:tcBorders>
               <w:top w:val="single" w:color="A893BC" w:sz="4"/>
               <w:left w:val="single" w:color="A893BC" w:sz="4"/>
@@ -7643,7 +8529,7 @@
         </w:tc>
         <w:tc>
           <w:tcPr>
-            <w:tcW w:type="dxa" w:w="5935"/>
+            <w:tcW w:type="dxa" w:w="5880"/>
             <w:tcBorders>
               <w:top w:val="single" w:color="A893BC" w:sz="4"/>
               <w:left w:val="single" w:color="A893BC" w:sz="4"/>
@@ -7674,7 +8560,7 @@
         </w:trPr>
         <w:tc>
           <w:tcPr>
-            <w:tcW w:type="dxa" w:w="3987"/>
+            <w:tcW w:type="dxa" w:w="4042"/>
             <w:tcBorders>
               <w:top w:val="single" w:color="A893BC" w:sz="4"/>
               <w:left w:val="single" w:color="A893BC" w:sz="4"/>
@@ -7699,7 +8585,7 @@
         </w:tc>
         <w:tc>
           <w:tcPr>
-            <w:tcW w:type="dxa" w:w="5935"/>
+            <w:tcW w:type="dxa" w:w="5880"/>
             <w:tcBorders>
               <w:top w:val="single" w:color="A893BC" w:sz="4"/>
               <w:left w:val="single" w:color="A893BC" w:sz="4"/>
@@ -7730,7 +8616,7 @@
         </w:trPr>
         <w:tc>
           <w:tcPr>
-            <w:tcW w:type="dxa" w:w="3987"/>
+            <w:tcW w:type="dxa" w:w="4042"/>
             <w:tcBorders>
               <w:top w:val="single" w:color="A893BC" w:sz="4"/>
               <w:left w:val="single" w:color="A893BC" w:sz="4"/>
@@ -7755,7 +8641,7 @@
         </w:tc>
         <w:tc>
           <w:tcPr>
-            <w:tcW w:type="dxa" w:w="5935"/>
+            <w:tcW w:type="dxa" w:w="5880"/>
             <w:tcBorders>
               <w:top w:val="single" w:color="A893BC" w:sz="4"/>
               <w:left w:val="single" w:color="A893BC" w:sz="4"/>
@@ -7786,7 +8672,7 @@
         </w:trPr>
         <w:tc>
           <w:tcPr>
-            <w:tcW w:type="dxa" w:w="3987"/>
+            <w:tcW w:type="dxa" w:w="4042"/>
             <w:tcBorders>
               <w:top w:val="single" w:color="A893BC" w:sz="4"/>
               <w:left w:val="single" w:color="A893BC" w:sz="4"/>
@@ -7811,7 +8697,7 @@
         </w:tc>
         <w:tc>
           <w:tcPr>
-            <w:tcW w:type="dxa" w:w="5935"/>
+            <w:tcW w:type="dxa" w:w="5880"/>
             <w:tcBorders>
               <w:top w:val="single" w:color="A893BC" w:sz="4"/>
               <w:left w:val="single" w:color="A893BC" w:sz="4"/>
@@ -7842,7 +8728,7 @@
         </w:trPr>
         <w:tc>
           <w:tcPr>
-            <w:tcW w:type="dxa" w:w="3987"/>
+            <w:tcW w:type="dxa" w:w="4042"/>
             <w:tcBorders>
               <w:top w:val="single" w:color="A893BC" w:sz="4"/>
               <w:left w:val="single" w:color="A893BC" w:sz="4"/>
@@ -7867,7 +8753,7 @@
         </w:tc>
         <w:tc>
           <w:tcPr>
-            <w:tcW w:type="dxa" w:w="5935"/>
+            <w:tcW w:type="dxa" w:w="5880"/>
             <w:tcBorders>
               <w:top w:val="single" w:color="A893BC" w:sz="4"/>
               <w:left w:val="single" w:color="A893BC" w:sz="4"/>
@@ -7898,7 +8784,7 @@
         </w:trPr>
         <w:tc>
           <w:tcPr>
-            <w:tcW w:type="dxa" w:w="3987"/>
+            <w:tcW w:type="dxa" w:w="4042"/>
             <w:tcBorders>
               <w:top w:val="single" w:color="A893BC" w:sz="4"/>
               <w:left w:val="single" w:color="A893BC" w:sz="4"/>
@@ -7923,7 +8809,7 @@
         </w:tc>
         <w:tc>
           <w:tcPr>
-            <w:tcW w:type="dxa" w:w="5935"/>
+            <w:tcW w:type="dxa" w:w="5880"/>
             <w:tcBorders>
               <w:top w:val="single" w:color="A893BC" w:sz="4"/>
               <w:left w:val="single" w:color="A893BC" w:sz="4"/>
@@ -7954,7 +8840,7 @@
         </w:trPr>
         <w:tc>
           <w:tcPr>
-            <w:tcW w:type="dxa" w:w="3987"/>
+            <w:tcW w:type="dxa" w:w="4042"/>
             <w:tcBorders>
               <w:top w:val="single" w:color="A893BC" w:sz="4"/>
               <w:left w:val="single" w:color="A893BC" w:sz="4"/>
@@ -7979,7 +8865,7 @@
         </w:tc>
         <w:tc>
           <w:tcPr>
-            <w:tcW w:type="dxa" w:w="5935"/>
+            <w:tcW w:type="dxa" w:w="5880"/>
             <w:tcBorders>
               <w:top w:val="single" w:color="A893BC" w:sz="4"/>
               <w:left w:val="single" w:color="A893BC" w:sz="4"/>
@@ -8010,7 +8896,7 @@
         </w:trPr>
         <w:tc>
           <w:tcPr>
-            <w:tcW w:type="dxa" w:w="3987"/>
+            <w:tcW w:type="dxa" w:w="4042"/>
             <w:tcBorders>
               <w:top w:val="single" w:color="A893BC" w:sz="4"/>
               <w:left w:val="single" w:color="A893BC" w:sz="4"/>
@@ -8035,7 +8921,7 @@
         </w:tc>
         <w:tc>
           <w:tcPr>
-            <w:tcW w:type="dxa" w:w="5935"/>
+            <w:tcW w:type="dxa" w:w="5880"/>
             <w:tcBorders>
               <w:top w:val="single" w:color="A893BC" w:sz="4"/>
               <w:left w:val="single" w:color="A893BC" w:sz="4"/>
@@ -8066,7 +8952,7 @@
         </w:trPr>
         <w:tc>
           <w:tcPr>
-            <w:tcW w:type="dxa" w:w="3987"/>
+            <w:tcW w:type="dxa" w:w="4042"/>
             <w:tcBorders>
               <w:top w:val="single" w:color="A893BC" w:sz="4"/>
               <w:left w:val="single" w:color="A893BC" w:sz="4"/>
@@ -8091,7 +8977,7 @@
         </w:tc>
         <w:tc>
           <w:tcPr>
-            <w:tcW w:type="dxa" w:w="5935"/>
+            <w:tcW w:type="dxa" w:w="5880"/>
             <w:tcBorders>
               <w:top w:val="single" w:color="A893BC" w:sz="4"/>
               <w:left w:val="single" w:color="A893BC" w:sz="4"/>
@@ -8146,7 +9032,7 @@
         </w:trPr>
         <w:tc>
           <w:tcPr>
-            <w:tcW w:type="dxa" w:w="3987"/>
+            <w:tcW w:type="dxa" w:w="4042"/>
             <w:tcBorders>
               <w:top w:val="single" w:color="A893BC" w:sz="4"/>
               <w:left w:val="single" w:color="A893BC" w:sz="4"/>
@@ -8171,7 +9057,7 @@
         </w:tc>
         <w:tc>
           <w:tcPr>
-            <w:tcW w:type="dxa" w:w="5935"/>
+            <w:tcW w:type="dxa" w:w="5880"/>
             <w:tcBorders>
               <w:top w:val="single" w:color="A893BC" w:sz="4"/>
               <w:left w:val="single" w:color="A893BC" w:sz="4"/>
@@ -8202,7 +9088,7 @@
         </w:trPr>
         <w:tc>
           <w:tcPr>
-            <w:tcW w:type="dxa" w:w="3987"/>
+            <w:tcW w:type="dxa" w:w="4042"/>
             <w:tcBorders>
               <w:top w:val="single" w:color="A893BC" w:sz="4"/>
               <w:left w:val="single" w:color="A893BC" w:sz="4"/>
@@ -8227,7 +9113,7 @@
         </w:tc>
         <w:tc>
           <w:tcPr>
-            <w:tcW w:type="dxa" w:w="5935"/>
+            <w:tcW w:type="dxa" w:w="5880"/>
             <w:tcBorders>
               <w:top w:val="single" w:color="A893BC" w:sz="4"/>
               <w:left w:val="single" w:color="A893BC" w:sz="4"/>
@@ -8258,7 +9144,7 @@
         </w:trPr>
         <w:tc>
           <w:tcPr>
-            <w:tcW w:type="dxa" w:w="3987"/>
+            <w:tcW w:type="dxa" w:w="4042"/>
             <w:tcBorders>
               <w:top w:val="single" w:color="A893BC" w:sz="4"/>
               <w:left w:val="single" w:color="A893BC" w:sz="4"/>
@@ -8283,7 +9169,7 @@
         </w:tc>
         <w:tc>
           <w:tcPr>
-            <w:tcW w:type="dxa" w:w="5935"/>
+            <w:tcW w:type="dxa" w:w="5880"/>
             <w:tcBorders>
               <w:top w:val="single" w:color="A893BC" w:sz="4"/>
               <w:left w:val="single" w:color="A893BC" w:sz="4"/>
@@ -8326,7 +9212,176 @@
         </w:trPr>
         <w:tc>
           <w:tcPr>
-            <w:tcW w:type="dxa" w:w="3987"/>
+            <w:tcW w:type="dxa" w:w="4042"/>
+            <w:tcBorders>
+              <w:top w:val="single" w:color="A893BC" w:sz="4"/>
+              <w:left w:val="single" w:color="A893BC" w:sz="4"/>
+              <w:bottom w:val="single" w:color="A893BC" w:sz="4"/>
+              <w:right w:val="single" w:color="A893BC" w:sz="4"/>
+            </w:tcBorders>
+            <w:tcMar>
+              <w:top w:type="dxa" w:w="60"/>
+              <w:left w:type="dxa" w:w="100"/>
+              <w:bottom w:type="dxa" w:w="60"/>
+              <w:right w:type="dxa" w:w="100"/>
+            </w:tcMar>
+          </w:tcPr>
+          <w:p>
+            <w:pPr>
+              <w:spacing w:after="0"/>
+            </w:pPr>
+            <w:r>
+              <w:t xml:space="preserve">Как сохраняется история?</w:t>
+            </w:r>
+          </w:p>
+        </w:tc>
+        <w:tc>
+          <w:tcPr>
+            <w:tcW w:type="dxa" w:w="5880"/>
+            <w:tcBorders>
+              <w:top w:val="single" w:color="A893BC" w:sz="4"/>
+              <w:left w:val="single" w:color="A893BC" w:sz="4"/>
+              <w:bottom w:val="single" w:color="A893BC" w:sz="4"/>
+              <w:right w:val="single" w:color="A893BC" w:sz="4"/>
+            </w:tcBorders>
+            <w:tcMar>
+              <w:top w:type="dxa" w:w="60"/>
+              <w:left w:type="dxa" w:w="100"/>
+              <w:bottom w:type="dxa" w:w="60"/>
+              <w:right w:type="dxa" w:w="100"/>
+            </w:tcMar>
+          </w:tcPr>
+          <w:p>
+            <w:pPr>
+              <w:spacing w:after="0"/>
+            </w:pPr>
+            <w:r>
+              <w:rPr>
+                <w:rFonts w:ascii="Consolas" w:cs="Consolas" w:eastAsia="Consolas" w:hAnsi="Consolas"/>
+                <w:color w:val="4A2A6A"/>
+                <w:sz w:val="21"/>
+                <w:szCs w:val="21"/>
+              </w:rPr>
+              <w:t xml:space="preserve">putStringArrayList("history", history)</w:t>
+            </w:r>
+            <w:r>
+              <w:t xml:space="preserve"> в </w:t>
+            </w:r>
+            <w:r>
+              <w:rPr>
+                <w:rFonts w:ascii="Consolas" w:cs="Consolas" w:eastAsia="Consolas" w:hAnsi="Consolas"/>
+                <w:color w:val="4A2A6A"/>
+                <w:sz w:val="21"/>
+                <w:szCs w:val="21"/>
+              </w:rPr>
+              <w:t xml:space="preserve">onSaveInstanceState</w:t>
+            </w:r>
+            <w:r>
+              <w:t xml:space="preserve">, восстанавливается </w:t>
+            </w:r>
+            <w:r>
+              <w:rPr>
+                <w:rFonts w:ascii="Consolas" w:cs="Consolas" w:eastAsia="Consolas" w:hAnsi="Consolas"/>
+                <w:color w:val="4A2A6A"/>
+                <w:sz w:val="21"/>
+                <w:szCs w:val="21"/>
+              </w:rPr>
+              <w:t xml:space="preserve">getStringArrayList</w:t>
+            </w:r>
+            <w:r>
+              <w:t xml:space="preserve"> с проверкой на null.</w:t>
+            </w:r>
+          </w:p>
+        </w:tc>
+      </w:tr>
+      <w:tr>
+        <w:trPr>
+          <w:cantSplit/>
+          <w:tblHeader w:val="false"/>
+        </w:trPr>
+        <w:tc>
+          <w:tcPr>
+            <w:tcW w:type="dxa" w:w="4042"/>
+            <w:tcBorders>
+              <w:top w:val="single" w:color="A893BC" w:sz="4"/>
+              <w:left w:val="single" w:color="A893BC" w:sz="4"/>
+              <w:bottom w:val="single" w:color="A893BC" w:sz="4"/>
+              <w:right w:val="single" w:color="A893BC" w:sz="4"/>
+            </w:tcBorders>
+            <w:tcMar>
+              <w:top w:type="dxa" w:w="60"/>
+              <w:left w:type="dxa" w:w="100"/>
+              <w:bottom w:type="dxa" w:w="60"/>
+              <w:right w:type="dxa" w:w="100"/>
+            </w:tcMar>
+          </w:tcPr>
+          <w:p>
+            <w:pPr>
+              <w:spacing w:after="0"/>
+            </w:pPr>
+            <w:r>
+              <w:t xml:space="preserve">Зачем </w:t>
+            </w:r>
+            <w:r>
+              <w:rPr>
+                <w:rFonts w:ascii="Consolas" w:cs="Consolas" w:eastAsia="Consolas" w:hAnsi="Consolas"/>
+                <w:color w:val="4A2A6A"/>
+                <w:sz w:val="21"/>
+                <w:szCs w:val="21"/>
+              </w:rPr>
+              <w:t xml:space="preserve">if (savedInstanceState != null)</w:t>
+            </w:r>
+            <w:r>
+              <w:t xml:space="preserve">?</w:t>
+            </w:r>
+          </w:p>
+        </w:tc>
+        <w:tc>
+          <w:tcPr>
+            <w:tcW w:type="dxa" w:w="5880"/>
+            <w:tcBorders>
+              <w:top w:val="single" w:color="A893BC" w:sz="4"/>
+              <w:left w:val="single" w:color="A893BC" w:sz="4"/>
+              <w:bottom w:val="single" w:color="A893BC" w:sz="4"/>
+              <w:right w:val="single" w:color="A893BC" w:sz="4"/>
+            </w:tcBorders>
+            <w:tcMar>
+              <w:top w:type="dxa" w:w="60"/>
+              <w:left w:type="dxa" w:w="100"/>
+              <w:bottom w:type="dxa" w:w="60"/>
+              <w:right w:type="dxa" w:w="100"/>
+            </w:tcMar>
+          </w:tcPr>
+          <w:p>
+            <w:pPr>
+              <w:spacing w:after="0"/>
+            </w:pPr>
+            <w:r>
+              <w:t xml:space="preserve">При первом запуске Bundle равен null, без проверки будет </w:t>
+            </w:r>
+            <w:r>
+              <w:rPr>
+                <w:rFonts w:ascii="Consolas" w:cs="Consolas" w:eastAsia="Consolas" w:hAnsi="Consolas"/>
+                <w:color w:val="4A2A6A"/>
+                <w:sz w:val="21"/>
+                <w:szCs w:val="21"/>
+              </w:rPr>
+              <w:t xml:space="preserve">NullPointerException</w:t>
+            </w:r>
+            <w:r>
+              <w:t xml:space="preserve">.</w:t>
+            </w:r>
+          </w:p>
+        </w:tc>
+      </w:tr>
+      <w:tr>
+        <w:trPr>
+          <w:cantSplit/>
+          <w:tblHeader w:val="false"/>
+        </w:trPr>
+        <w:tc>
+          <w:tcPr>
+            <w:tcW w:type="dxa" w:w="4042"/>
             <w:tcBorders>
               <w:top w:val="single" w:color="A893BC" w:sz="4"/>
               <w:left w:val="single" w:color="A893BC" w:sz="4"/>
@@ -8351,7 +9406,7 @@
         </w:tc>
         <w:tc>
           <w:tcPr>
-            <w:tcW w:type="dxa" w:w="5935"/>
+            <w:tcW w:type="dxa" w:w="5880"/>
             <w:tcBorders>
               <w:top w:val="single" w:color="A893BC" w:sz="4"/>
               <w:left w:val="single" w:color="A893BC" w:sz="4"/>

</xml_diff>